<commit_message>
Muda o fechamento da entrega para domingo
- Semana 1 passa a fechar domingo 27/09 as 23h59, em vez de sexta 25/09
- Piloto vira de sexta a domingo, dez dias, e o ciclo 2 entra no padrao da
  sabatina sem emenda: segunda 28/09 a domingo 04/10
- Correcao e gabarito saem de sabado para segunda, porque com fechamento no
  domingo a correcao nao cabe mais no fim de semana. Segunda de manha abre o
  ciclo seguinte e segunda as 19h saem gabarito, notas e Dupla Destaque
- Lembrete de prazo muda de quinta para sabado
- Primeiro degrau da regua de cobranca passa a ser quarta e sabado
- Reconhecimento deixa de dividir post com a abertura: agora sao dois posts na
  segunda, um de manha e um a noite
- Ajustado no enunciado, no framework, na gamificacao e no documento de duplas
</commit_message>
<xml_diff>
--- a/ciclo-de-cases/Gamificacao, cobranca e recompensas.docx
+++ b/ciclo-de-cases/Gamificacao, cobranca e recompensas.docx
@@ -986,7 +986,7 @@
                 <w:color w:val="1E293B"/>
                 <w:sz w:val="17"/>
               </w:rPr>
-              <w:t>Quarta e quinta da semana</w:t>
+              <w:t>Quarta e sábado da semana</w:t>
             </w:r>
           </w:p>
         </w:tc>
@@ -1401,7 +1401,7 @@
                 <w:color w:val="1E293B"/>
                 <w:sz w:val="17"/>
               </w:rPr>
-              <w:t>Dupla Destaque anunciada na abertura do ciclo seguinte, com uma frase dizendo o que ela fez de diferente. A entrega dela é citada no gabarito como referência</w:t>
+              <w:t>Dupla Destaque anunciada na segunda à noite, junto com o gabarito, com uma frase dizendo o que ela fez de diferente. A entrega dela é citada no gabarito como referência</w:t>
             </w:r>
           </w:p>
         </w:tc>
@@ -1648,7 +1648,7 @@
           <w:color w:val="1E293B"/>
           <w:sz w:val="19"/>
         </w:rPr>
-        <w:t>no mesmo post que abre o ciclo seguinte, segunda às 9h. Um disparo, dois efeitos.</w:t>
+        <w:t>na segunda à noite, junto com o gabarito e as notas. O ciclo seguinte já abriu de manhã, então são dois posts no mesmo dia.</w:t>
       </w:r>
     </w:p>
     <w:p>

</xml_diff>